<commit_message>
CR-EVENTS-MANAGE v1.1 -> v1.2: event publishing, public discovery, recording migration
Part of the batched CR-EVENTS publishing / CR-RESOURCES carry-forward.
- Workflow: new publish-to-list step (listedPublicly, reversible, records publishedAt)
  and public browse-and-register step (custom web app; listed + Scheduled + not-yet-
  started, soonest-first, drop-off at start; routes into existing Contact/Account flow).
- New optional recording-migration step (recordingUrl -> download/edit/re-host ->
  create+publish a Resource linked to the Event; raw recordingUrl stays back-office).
- Cancel and Postpone steps now clear listedPublicly (auto-unlist).
- Data items DAT-054 (listedPublicly) and DAT-055 (publishedAt) added to Section 8.
- Requirements REQ-055/056/057 added; v1.2 change-log row.
</commit_message>
<xml_diff>
--- a/PRDs/CR/EVENTS/CR-EVENTS-MANAGE.docx
+++ b/PRDs/CR/EVENTS/CR-EVENTS-MANAGE.docx
@@ -329,7 +329,7 @@
                 <w:sz w:val="20"/>
                 <w:szCs w:val="20"/>
               </w:rPr>
-              <w:t xml:space="preserve">1.1</w:t>
+              <w:t xml:space="preserve">1.2</w:t>
             </w:r>
           </w:p>
         </w:tc>
@@ -459,7 +459,7 @@
                 <w:sz w:val="20"/>
                 <w:szCs w:val="20"/>
               </w:rPr>
-              <w:t xml:space="preserve">05-29-26 14:00</w:t>
+              <w:t xml:space="preserve">05-29-26 16:30</w:t>
             </w:r>
           </w:p>
         </w:tc>
@@ -1091,6 +1091,50 @@
           <w:sz w:val="22"/>
           <w:szCs w:val="22"/>
         </w:rPr>
+        <w:t xml:space="preserve">When the Event is ready to be advertised, the Content and Event Administrator publishes it to the public list of available events by setting listedPublicly. Publishing is a deliberate, reversible action that is separate from the Scheduled transition: an Event can be Scheduled without being listed, and it can be unlisted again without changing status. The system records the moment of first publication in publishedAt. Listing is independent of whether registration is open.</w:t>
+      </w:r>
+    </w:p>
+    <w:p>
+      <w:pPr>
+        <w:pStyle w:val="ListParagraph"/>
+        <w:numPr>
+          <w:ilvl w:val="0"/>
+          <w:numId w:val="3"/>
+        </w:numPr>
+        <w:spacing w:after="80"/>
+      </w:pPr>
+      <w:r>
+        <w:rPr>
+          <w:rFonts w:ascii="Arial" w:cs="Arial" w:eastAsia="Arial" w:hAnsi="Arial"/>
+          <w:b w:val="false"/>
+          <w:bCs w:val="false"/>
+          <w:i w:val="false"/>
+          <w:iCs w:val="false"/>
+          <w:sz w:val="22"/>
+          <w:szCs w:val="22"/>
+        </w:rPr>
+        <w:t xml:space="preserve">Prospective attendees browse the public list of available events in the custom web application. The list shows only Events that are listed, at Scheduled status, and not yet started, ordered soonest-first; an Event drops off the list at its start time. Selecting an Event leads to the same public registration form, so a registration that originates from the list follows the identical Contact match-or-create and Account precedence handling described in the following steps.</w:t>
+      </w:r>
+    </w:p>
+    <w:p>
+      <w:pPr>
+        <w:pStyle w:val="ListParagraph"/>
+        <w:numPr>
+          <w:ilvl w:val="0"/>
+          <w:numId w:val="3"/>
+        </w:numPr>
+        <w:spacing w:after="80"/>
+      </w:pPr>
+      <w:r>
+        <w:rPr>
+          <w:rFonts w:ascii="Arial" w:cs="Arial" w:eastAsia="Arial" w:hAnsi="Arial"/>
+          <w:b w:val="false"/>
+          <w:bCs w:val="false"/>
+          <w:i w:val="false"/>
+          <w:iCs w:val="false"/>
+          <w:sz w:val="22"/>
+          <w:szCs w:val="22"/>
+        </w:rPr>
         <w:t xml:space="preserve">Registrants submit the public registration form. For each submission the system evaluates the registration inputs, creates or matches a Contact record following the Universal Contact-Creation Rules, creates an Event Registration record linking the Contact to the Event, and queues a confirmation email.</w:t>
       </w:r>
     </w:p>
@@ -1245,7 +1289,7 @@
           <w:sz w:val="22"/>
           <w:szCs w:val="22"/>
         </w:rPr>
-        <w:t xml:space="preserve">If the event is cancelled, the Content and Event Administrator manually transitions the Event to Cancelled. If registrations exist, the system surfaces a confirmation dialog displaying the registration count. No automatic cancellation notification is sent to registrants. The Administrator composes and sends the cancellation communication as a separate action.</w:t>
+        <w:t xml:space="preserve">If the event is cancelled, the Content and Event Administrator manually transitions the Event to Cancelled. If registrations exist, the system surfaces a confirmation dialog displaying the registration count. No automatic cancellation notification is sent to registrants. The Administrator composes and sends the cancellation communication as a separate action. On the transition to Cancelled, the system also clears listedPublicly, removing the Event from the public list of available events.</w:t>
       </w:r>
     </w:p>
     <w:p>
@@ -1267,7 +1311,7 @@
           <w:sz w:val="22"/>
           <w:szCs w:val="22"/>
         </w:rPr>
-        <w:t xml:space="preserve">If the event is rescheduled, the Content and Event Administrator manually transitions the Event to Postponed, revises dateStart and dateEnd to the new values once known, and transitions back to Scheduled. The same confirmation-dialog guard applies. Existing Event Registrations are retained across the Postponed transition; registrants remain registered for the rescheduled event unless individually cancelled.</w:t>
+        <w:t xml:space="preserve">If the event is rescheduled, the Content and Event Administrator manually transitions the Event to Postponed, revises dateStart and dateEnd to the new values once known, and transitions back to Scheduled. The same confirmation-dialog guard applies. Existing Event Registrations are retained across the Postponed transition; registrants remain registered for the rescheduled event unless individually cancelled. The transition to Postponed clears listedPublicly, so the Event no longer appears on the public list; after rescheduling and transitioning back to Scheduled, the Administrator re-publishes the Event to the list if it should appear again.</w:t>
       </w:r>
     </w:p>
     <w:p>
@@ -1356,6 +1400,28 @@
           <w:szCs w:val="22"/>
         </w:rPr>
         <w:t xml:space="preserve">The Content and Event Administrator may correct any attendance record at any time through direct edit on the Event Registration. The Event.status value is not reset by late attendance corrections.</w:t>
+      </w:r>
+    </w:p>
+    <w:p>
+      <w:pPr>
+        <w:pStyle w:val="ListParagraph"/>
+        <w:numPr>
+          <w:ilvl w:val="0"/>
+          <w:numId w:val="3"/>
+        </w:numPr>
+        <w:spacing w:after="80"/>
+      </w:pPr>
+      <w:r>
+        <w:rPr>
+          <w:rFonts w:ascii="Arial" w:cs="Arial" w:eastAsia="Arial" w:hAnsi="Arial"/>
+          <w:b w:val="false"/>
+          <w:bCs w:val="false"/>
+          <w:i w:val="false"/>
+          <w:iCs w:val="false"/>
+          <w:sz w:val="22"/>
+          <w:szCs w:val="22"/>
+        </w:rPr>
+        <w:t xml:space="preserve">After the Event reaches Completed and a recording exists, the Content and Event Administrator may publish that recording to the public Resources page. Using recordingUrl as the entry point, the Administrator reaches the raw recording in the system that captured it, downloads and edits it, and re-hosts the finished version in a reliable location. The Administrator then creates a Resource record for the edited recording, links it to this Event, and publishes it. The raw recordingUrl remains a back-office reference and never appears on the public Resources page; the published copy is the separate Resource. This recording-migration step is manual and optional per Event. See the Resource entity and the CR-RESOURCES sub-domain.</w:t>
       </w:r>
     </w:p>
     <w:p>
@@ -5248,6 +5314,204 @@
           </w:p>
         </w:tc>
       </w:tr>
+      <w:tr>
+        <w:tc>
+          <w:tcPr>
+            <w:tcW w:type="dxa" w:w="2400"/>
+            <w:tcBorders>
+              <w:top w:val="single" w:color="AAAAAA" w:sz="1"/>
+              <w:left w:val="single" w:color="AAAAAA" w:sz="1"/>
+              <w:bottom w:val="single" w:color="AAAAAA" w:sz="1"/>
+              <w:right w:val="single" w:color="AAAAAA" w:sz="1"/>
+            </w:tcBorders>
+            <w:shd w:fill="FFFFFF" w:val="clear"/>
+            <w:tcMar>
+              <w:top w:type="dxa" w:w="60"/>
+              <w:left w:type="dxa" w:w="100"/>
+              <w:bottom w:type="dxa" w:w="60"/>
+              <w:right w:type="dxa" w:w="100"/>
+            </w:tcMar>
+          </w:tcPr>
+          <w:p>
+            <w:r>
+              <w:rPr>
+                <w:rFonts w:ascii="Arial" w:cs="Arial" w:eastAsia="Arial" w:hAnsi="Arial"/>
+                <w:b/>
+                <w:bCs/>
+                <w:i w:val="false"/>
+                <w:iCs w:val="false"/>
+                <w:sz w:val="20"/>
+                <w:szCs w:val="20"/>
+              </w:rPr>
+              <w:t xml:space="preserve">CR-EVENTS-MANAGE-REQ-055</w:t>
+            </w:r>
+          </w:p>
+        </w:tc>
+        <w:tc>
+          <w:tcPr>
+            <w:tcW w:type="dxa" w:w="6960"/>
+            <w:tcBorders>
+              <w:top w:val="single" w:color="AAAAAA" w:sz="1"/>
+              <w:left w:val="single" w:color="AAAAAA" w:sz="1"/>
+              <w:bottom w:val="single" w:color="AAAAAA" w:sz="1"/>
+              <w:right w:val="single" w:color="AAAAAA" w:sz="1"/>
+            </w:tcBorders>
+            <w:shd w:fill="FFFFFF" w:val="clear"/>
+            <w:tcMar>
+              <w:top w:type="dxa" w:w="60"/>
+              <w:left w:type="dxa" w:w="100"/>
+              <w:bottom w:type="dxa" w:w="60"/>
+              <w:right w:type="dxa" w:w="100"/>
+            </w:tcMar>
+          </w:tcPr>
+          <w:p>
+            <w:r>
+              <w:rPr>
+                <w:rFonts w:ascii="Arial" w:cs="Arial" w:eastAsia="Arial" w:hAnsi="Arial"/>
+                <w:b w:val="false"/>
+                <w:bCs w:val="false"/>
+                <w:i w:val="false"/>
+                <w:iCs w:val="false"/>
+                <w:sz w:val="20"/>
+                <w:szCs w:val="20"/>
+              </w:rPr>
+              <w:t xml:space="preserve">The system must provide a reversible publish-to-list action on the Event, controlled by listedPublicly and independent of the Scheduled status, and must record the first-publication time in publishedAt.</w:t>
+            </w:r>
+          </w:p>
+        </w:tc>
+      </w:tr>
+      <w:tr>
+        <w:tc>
+          <w:tcPr>
+            <w:tcW w:type="dxa" w:w="2400"/>
+            <w:tcBorders>
+              <w:top w:val="single" w:color="AAAAAA" w:sz="1"/>
+              <w:left w:val="single" w:color="AAAAAA" w:sz="1"/>
+              <w:bottom w:val="single" w:color="AAAAAA" w:sz="1"/>
+              <w:right w:val="single" w:color="AAAAAA" w:sz="1"/>
+            </w:tcBorders>
+            <w:shd w:fill="FFFFFF" w:val="clear"/>
+            <w:tcMar>
+              <w:top w:type="dxa" w:w="60"/>
+              <w:left w:type="dxa" w:w="100"/>
+              <w:bottom w:type="dxa" w:w="60"/>
+              <w:right w:type="dxa" w:w="100"/>
+            </w:tcMar>
+          </w:tcPr>
+          <w:p>
+            <w:r>
+              <w:rPr>
+                <w:rFonts w:ascii="Arial" w:cs="Arial" w:eastAsia="Arial" w:hAnsi="Arial"/>
+                <w:b/>
+                <w:bCs/>
+                <w:i w:val="false"/>
+                <w:iCs w:val="false"/>
+                <w:sz w:val="20"/>
+                <w:szCs w:val="20"/>
+              </w:rPr>
+              <w:t xml:space="preserve">CR-EVENTS-MANAGE-REQ-056</w:t>
+            </w:r>
+          </w:p>
+        </w:tc>
+        <w:tc>
+          <w:tcPr>
+            <w:tcW w:type="dxa" w:w="6960"/>
+            <w:tcBorders>
+              <w:top w:val="single" w:color="AAAAAA" w:sz="1"/>
+              <w:left w:val="single" w:color="AAAAAA" w:sz="1"/>
+              <w:bottom w:val="single" w:color="AAAAAA" w:sz="1"/>
+              <w:right w:val="single" w:color="AAAAAA" w:sz="1"/>
+            </w:tcBorders>
+            <w:shd w:fill="FFFFFF" w:val="clear"/>
+            <w:tcMar>
+              <w:top w:type="dxa" w:w="60"/>
+              <w:left w:type="dxa" w:w="100"/>
+              <w:bottom w:type="dxa" w:w="60"/>
+              <w:right w:type="dxa" w:w="100"/>
+            </w:tcMar>
+          </w:tcPr>
+          <w:p>
+            <w:r>
+              <w:rPr>
+                <w:rFonts w:ascii="Arial" w:cs="Arial" w:eastAsia="Arial" w:hAnsi="Arial"/>
+                <w:b w:val="false"/>
+                <w:bCs w:val="false"/>
+                <w:i w:val="false"/>
+                <w:iCs w:val="false"/>
+                <w:sz w:val="20"/>
+                <w:szCs w:val="20"/>
+              </w:rPr>
+              <w:t xml:space="preserve">The public list of available events must show only Events that are listed, at Scheduled status, and not yet started, ordered soonest-first, with each Event dropping off the list at its start time; the system must clear listedPublicly automatically when an Event transitions to Cancelled or Postponed.</w:t>
+            </w:r>
+          </w:p>
+        </w:tc>
+      </w:tr>
+      <w:tr>
+        <w:tc>
+          <w:tcPr>
+            <w:tcW w:type="dxa" w:w="2400"/>
+            <w:tcBorders>
+              <w:top w:val="single" w:color="AAAAAA" w:sz="1"/>
+              <w:left w:val="single" w:color="AAAAAA" w:sz="1"/>
+              <w:bottom w:val="single" w:color="AAAAAA" w:sz="1"/>
+              <w:right w:val="single" w:color="AAAAAA" w:sz="1"/>
+            </w:tcBorders>
+            <w:shd w:fill="FFFFFF" w:val="clear"/>
+            <w:tcMar>
+              <w:top w:type="dxa" w:w="60"/>
+              <w:left w:type="dxa" w:w="100"/>
+              <w:bottom w:type="dxa" w:w="60"/>
+              <w:right w:type="dxa" w:w="100"/>
+            </w:tcMar>
+          </w:tcPr>
+          <w:p>
+            <w:r>
+              <w:rPr>
+                <w:rFonts w:ascii="Arial" w:cs="Arial" w:eastAsia="Arial" w:hAnsi="Arial"/>
+                <w:b/>
+                <w:bCs/>
+                <w:i w:val="false"/>
+                <w:iCs w:val="false"/>
+                <w:sz w:val="20"/>
+                <w:szCs w:val="20"/>
+              </w:rPr>
+              <w:t xml:space="preserve">CR-EVENTS-MANAGE-REQ-057</w:t>
+            </w:r>
+          </w:p>
+        </w:tc>
+        <w:tc>
+          <w:tcPr>
+            <w:tcW w:type="dxa" w:w="6960"/>
+            <w:tcBorders>
+              <w:top w:val="single" w:color="AAAAAA" w:sz="1"/>
+              <w:left w:val="single" w:color="AAAAAA" w:sz="1"/>
+              <w:bottom w:val="single" w:color="AAAAAA" w:sz="1"/>
+              <w:right w:val="single" w:color="AAAAAA" w:sz="1"/>
+            </w:tcBorders>
+            <w:shd w:fill="FFFFFF" w:val="clear"/>
+            <w:tcMar>
+              <w:top w:type="dxa" w:w="60"/>
+              <w:left w:type="dxa" w:w="100"/>
+              <w:bottom w:type="dxa" w:w="60"/>
+              <w:right w:type="dxa" w:w="100"/>
+            </w:tcMar>
+          </w:tcPr>
+          <w:p>
+            <w:r>
+              <w:rPr>
+                <w:rFonts w:ascii="Arial" w:cs="Arial" w:eastAsia="Arial" w:hAnsi="Arial"/>
+                <w:b w:val="false"/>
+                <w:bCs w:val="false"/>
+                <w:i w:val="false"/>
+                <w:iCs w:val="false"/>
+                <w:sz w:val="20"/>
+                <w:szCs w:val="20"/>
+              </w:rPr>
+              <w:t xml:space="preserve">The system must allow an Administrator to migrate a completed Event's recording into a published Resource: recordingUrl provides access to the raw recording, and the edited, re-hosted copy is published as a separate Resource record linked to the Event. The raw recordingUrl must never appear on the public Resources page.</w:t>
+            </w:r>
+          </w:p>
+        </w:tc>
+      </w:tr>
     </w:tbl>
     <w:p>
       <w:pPr>
@@ -18486,6 +18750,530 @@
         </w:tc>
       </w:tr>
     </w:tbl>
+    <w:p>
+      <w:r>
+        <w:rPr>
+          <w:rFonts w:ascii="Arial" w:cs="Arial" w:eastAsia="Arial" w:hAnsi="Arial"/>
+          <w:b/>
+          <w:bCs/>
+          <w:sz w:val="22"/>
+          <w:szCs w:val="22"/>
+        </w:rPr>
+        <w:t xml:space="preserve">Publishing Data Items</w:t>
+      </w:r>
+    </w:p>
+    <w:tbl>
+      <w:tblPr>
+        <w:tblW w:type="dxa" w:w="9360"/>
+        <w:tblBorders>
+          <w:top w:val="single" w:color="AAAAAA" w:sz="1"/>
+          <w:left w:val="single" w:color="AAAAAA" w:sz="1"/>
+          <w:bottom w:val="single" w:color="AAAAAA" w:sz="1"/>
+          <w:right w:val="single" w:color="AAAAAA" w:sz="1"/>
+          <w:insideH w:val="single" w:color="AAAAAA" w:sz="1"/>
+          <w:insideV w:val="single" w:color="AAAAAA" w:sz="1"/>
+        </w:tblBorders>
+      </w:tblPr>
+      <w:tblGrid>
+        <w:gridCol w:w="1900"/>
+        <w:gridCol w:w="1500"/>
+        <w:gridCol w:w="950"/>
+        <w:gridCol w:w="2450"/>
+        <w:gridCol w:w="2560"/>
+      </w:tblGrid>
+      <w:tr>
+        <w:tc>
+          <w:tcPr>
+            <w:tcW w:type="dxa" w:w="1900"/>
+            <w:tcBorders>
+              <w:top w:val="single" w:color="AAAAAA" w:sz="1"/>
+              <w:left w:val="single" w:color="AAAAAA" w:sz="1"/>
+              <w:bottom w:val="single" w:color="AAAAAA" w:sz="1"/>
+              <w:right w:val="single" w:color="AAAAAA" w:sz="1"/>
+            </w:tcBorders>
+            <w:shd w:fill="1F3864" w:val="clear"/>
+            <w:tcMar>
+              <w:top w:type="dxa" w:w="60"/>
+              <w:left w:type="dxa" w:w="100"/>
+              <w:bottom w:type="dxa" w:w="60"/>
+              <w:right w:type="dxa" w:w="100"/>
+            </w:tcMar>
+          </w:tcPr>
+          <w:p>
+            <w:r>
+              <w:rPr>
+                <w:rFonts w:ascii="Arial" w:cs="Arial" w:eastAsia="Arial" w:hAnsi="Arial"/>
+                <w:b/>
+                <w:bCs/>
+                <w:i w:val="false"/>
+                <w:iCs w:val="false"/>
+                <w:color w:val="FFFFFF"/>
+                <w:sz w:val="20"/>
+                <w:szCs w:val="20"/>
+              </w:rPr>
+              <w:t xml:space="preserve">Field Name</w:t>
+            </w:r>
+          </w:p>
+        </w:tc>
+        <w:tc>
+          <w:tcPr>
+            <w:tcW w:type="dxa" w:w="1500"/>
+            <w:tcBorders>
+              <w:top w:val="single" w:color="AAAAAA" w:sz="1"/>
+              <w:left w:val="single" w:color="AAAAAA" w:sz="1"/>
+              <w:bottom w:val="single" w:color="AAAAAA" w:sz="1"/>
+              <w:right w:val="single" w:color="AAAAAA" w:sz="1"/>
+            </w:tcBorders>
+            <w:shd w:fill="1F3864" w:val="clear"/>
+            <w:tcMar>
+              <w:top w:type="dxa" w:w="60"/>
+              <w:left w:type="dxa" w:w="100"/>
+              <w:bottom w:type="dxa" w:w="60"/>
+              <w:right w:type="dxa" w:w="100"/>
+            </w:tcMar>
+          </w:tcPr>
+          <w:p>
+            <w:r>
+              <w:rPr>
+                <w:rFonts w:ascii="Arial" w:cs="Arial" w:eastAsia="Arial" w:hAnsi="Arial"/>
+                <w:b/>
+                <w:bCs/>
+                <w:i w:val="false"/>
+                <w:iCs w:val="false"/>
+                <w:color w:val="FFFFFF"/>
+                <w:sz w:val="20"/>
+                <w:szCs w:val="20"/>
+              </w:rPr>
+              <w:t xml:space="preserve">Entity</w:t>
+            </w:r>
+          </w:p>
+        </w:tc>
+        <w:tc>
+          <w:tcPr>
+            <w:tcW w:type="dxa" w:w="950"/>
+            <w:tcBorders>
+              <w:top w:val="single" w:color="AAAAAA" w:sz="1"/>
+              <w:left w:val="single" w:color="AAAAAA" w:sz="1"/>
+              <w:bottom w:val="single" w:color="AAAAAA" w:sz="1"/>
+              <w:right w:val="single" w:color="AAAAAA" w:sz="1"/>
+            </w:tcBorders>
+            <w:shd w:fill="1F3864" w:val="clear"/>
+            <w:tcMar>
+              <w:top w:type="dxa" w:w="60"/>
+              <w:left w:type="dxa" w:w="100"/>
+              <w:bottom w:type="dxa" w:w="60"/>
+              <w:right w:type="dxa" w:w="100"/>
+            </w:tcMar>
+          </w:tcPr>
+          <w:p>
+            <w:r>
+              <w:rPr>
+                <w:rFonts w:ascii="Arial" w:cs="Arial" w:eastAsia="Arial" w:hAnsi="Arial"/>
+                <w:b/>
+                <w:bCs/>
+                <w:i w:val="false"/>
+                <w:iCs w:val="false"/>
+                <w:color w:val="FFFFFF"/>
+                <w:sz w:val="20"/>
+                <w:szCs w:val="20"/>
+              </w:rPr>
+              <w:t xml:space="preserve">Type</w:t>
+            </w:r>
+          </w:p>
+        </w:tc>
+        <w:tc>
+          <w:tcPr>
+            <w:tcW w:type="dxa" w:w="2450"/>
+            <w:tcBorders>
+              <w:top w:val="single" w:color="AAAAAA" w:sz="1"/>
+              <w:left w:val="single" w:color="AAAAAA" w:sz="1"/>
+              <w:bottom w:val="single" w:color="AAAAAA" w:sz="1"/>
+              <w:right w:val="single" w:color="AAAAAA" w:sz="1"/>
+            </w:tcBorders>
+            <w:shd w:fill="1F3864" w:val="clear"/>
+            <w:tcMar>
+              <w:top w:type="dxa" w:w="60"/>
+              <w:left w:type="dxa" w:w="100"/>
+              <w:bottom w:type="dxa" w:w="60"/>
+              <w:right w:type="dxa" w:w="100"/>
+            </w:tcMar>
+          </w:tcPr>
+          <w:p>
+            <w:r>
+              <w:rPr>
+                <w:rFonts w:ascii="Arial" w:cs="Arial" w:eastAsia="Arial" w:hAnsi="Arial"/>
+                <w:b/>
+                <w:bCs/>
+                <w:i w:val="false"/>
+                <w:iCs w:val="false"/>
+                <w:color w:val="FFFFFF"/>
+                <w:sz w:val="20"/>
+                <w:szCs w:val="20"/>
+              </w:rPr>
+              <w:t xml:space="preserve">Identifier</w:t>
+            </w:r>
+          </w:p>
+        </w:tc>
+        <w:tc>
+          <w:tcPr>
+            <w:tcW w:type="dxa" w:w="2560"/>
+            <w:tcBorders>
+              <w:top w:val="single" w:color="AAAAAA" w:sz="1"/>
+              <w:left w:val="single" w:color="AAAAAA" w:sz="1"/>
+              <w:bottom w:val="single" w:color="AAAAAA" w:sz="1"/>
+              <w:right w:val="single" w:color="AAAAAA" w:sz="1"/>
+            </w:tcBorders>
+            <w:shd w:fill="1F3864" w:val="clear"/>
+            <w:tcMar>
+              <w:top w:type="dxa" w:w="60"/>
+              <w:left w:type="dxa" w:w="100"/>
+              <w:bottom w:type="dxa" w:w="60"/>
+              <w:right w:type="dxa" w:w="100"/>
+            </w:tcMar>
+          </w:tcPr>
+          <w:p>
+            <w:r>
+              <w:rPr>
+                <w:rFonts w:ascii="Arial" w:cs="Arial" w:eastAsia="Arial" w:hAnsi="Arial"/>
+                <w:b/>
+                <w:bCs/>
+                <w:i w:val="false"/>
+                <w:iCs w:val="false"/>
+                <w:color w:val="FFFFFF"/>
+                <w:sz w:val="20"/>
+                <w:szCs w:val="20"/>
+              </w:rPr>
+              <w:t xml:space="preserve">Description</w:t>
+            </w:r>
+          </w:p>
+        </w:tc>
+      </w:tr>
+      <w:tr>
+        <w:tc>
+          <w:tcPr>
+            <w:tcW w:type="dxa" w:w="1900"/>
+            <w:tcBorders>
+              <w:top w:val="single" w:color="AAAAAA" w:sz="1"/>
+              <w:left w:val="single" w:color="AAAAAA" w:sz="1"/>
+              <w:bottom w:val="single" w:color="AAAAAA" w:sz="1"/>
+              <w:right w:val="single" w:color="AAAAAA" w:sz="1"/>
+            </w:tcBorders>
+            <w:shd w:fill="FFFFFF" w:val="clear"/>
+            <w:tcMar>
+              <w:top w:type="dxa" w:w="60"/>
+              <w:left w:type="dxa" w:w="100"/>
+              <w:bottom w:type="dxa" w:w="60"/>
+              <w:right w:type="dxa" w:w="100"/>
+            </w:tcMar>
+          </w:tcPr>
+          <w:p>
+            <w:r>
+              <w:rPr>
+                <w:rFonts w:ascii="Arial" w:cs="Arial" w:eastAsia="Arial" w:hAnsi="Arial"/>
+                <w:b w:val="false"/>
+                <w:bCs w:val="false"/>
+                <w:i w:val="false"/>
+                <w:iCs w:val="false"/>
+                <w:sz w:val="20"/>
+                <w:szCs w:val="20"/>
+              </w:rPr>
+              <w:t xml:space="preserve">listedPublicly</w:t>
+            </w:r>
+          </w:p>
+        </w:tc>
+        <w:tc>
+          <w:tcPr>
+            <w:tcW w:type="dxa" w:w="1500"/>
+            <w:tcBorders>
+              <w:top w:val="single" w:color="AAAAAA" w:sz="1"/>
+              <w:left w:val="single" w:color="AAAAAA" w:sz="1"/>
+              <w:bottom w:val="single" w:color="AAAAAA" w:sz="1"/>
+              <w:right w:val="single" w:color="AAAAAA" w:sz="1"/>
+            </w:tcBorders>
+            <w:shd w:fill="FFFFFF" w:val="clear"/>
+            <w:tcMar>
+              <w:top w:type="dxa" w:w="60"/>
+              <w:left w:type="dxa" w:w="100"/>
+              <w:bottom w:type="dxa" w:w="60"/>
+              <w:right w:type="dxa" w:w="100"/>
+            </w:tcMar>
+          </w:tcPr>
+          <w:p>
+            <w:r>
+              <w:rPr>
+                <w:rFonts w:ascii="Arial" w:cs="Arial" w:eastAsia="Arial" w:hAnsi="Arial"/>
+                <w:b w:val="false"/>
+                <w:bCs w:val="false"/>
+                <w:i w:val="false"/>
+                <w:iCs w:val="false"/>
+                <w:sz w:val="20"/>
+                <w:szCs w:val="20"/>
+              </w:rPr>
+              <w:t xml:space="preserve">Event</w:t>
+            </w:r>
+          </w:p>
+        </w:tc>
+        <w:tc>
+          <w:tcPr>
+            <w:tcW w:type="dxa" w:w="950"/>
+            <w:tcBorders>
+              <w:top w:val="single" w:color="AAAAAA" w:sz="1"/>
+              <w:left w:val="single" w:color="AAAAAA" w:sz="1"/>
+              <w:bottom w:val="single" w:color="AAAAAA" w:sz="1"/>
+              <w:right w:val="single" w:color="AAAAAA" w:sz="1"/>
+            </w:tcBorders>
+            <w:shd w:fill="FFFFFF" w:val="clear"/>
+            <w:tcMar>
+              <w:top w:type="dxa" w:w="60"/>
+              <w:left w:type="dxa" w:w="100"/>
+              <w:bottom w:type="dxa" w:w="60"/>
+              <w:right w:type="dxa" w:w="100"/>
+            </w:tcMar>
+          </w:tcPr>
+          <w:p>
+            <w:r>
+              <w:rPr>
+                <w:rFonts w:ascii="Arial" w:cs="Arial" w:eastAsia="Arial" w:hAnsi="Arial"/>
+                <w:b w:val="false"/>
+                <w:bCs w:val="false"/>
+                <w:i w:val="false"/>
+                <w:iCs w:val="false"/>
+                <w:sz w:val="20"/>
+                <w:szCs w:val="20"/>
+              </w:rPr>
+              <w:t xml:space="preserve">boolean</w:t>
+            </w:r>
+          </w:p>
+        </w:tc>
+        <w:tc>
+          <w:tcPr>
+            <w:tcW w:type="dxa" w:w="2450"/>
+            <w:tcBorders>
+              <w:top w:val="single" w:color="AAAAAA" w:sz="1"/>
+              <w:left w:val="single" w:color="AAAAAA" w:sz="1"/>
+              <w:bottom w:val="single" w:color="AAAAAA" w:sz="1"/>
+              <w:right w:val="single" w:color="AAAAAA" w:sz="1"/>
+            </w:tcBorders>
+            <w:shd w:fill="FFFFFF" w:val="clear"/>
+            <w:tcMar>
+              <w:top w:type="dxa" w:w="60"/>
+              <w:left w:type="dxa" w:w="100"/>
+              <w:bottom w:type="dxa" w:w="60"/>
+              <w:right w:type="dxa" w:w="100"/>
+            </w:tcMar>
+          </w:tcPr>
+          <w:p>
+            <w:r>
+              <w:rPr>
+                <w:rFonts w:ascii="Arial" w:cs="Arial" w:eastAsia="Arial" w:hAnsi="Arial"/>
+                <w:b w:val="false"/>
+                <w:bCs w:val="false"/>
+                <w:i w:val="false"/>
+                <w:iCs w:val="false"/>
+                <w:sz w:val="20"/>
+                <w:szCs w:val="20"/>
+              </w:rPr>
+              <w:t xml:space="preserve">CR-EVENTS-MANAGE-DAT-054</w:t>
+            </w:r>
+          </w:p>
+        </w:tc>
+        <w:tc>
+          <w:tcPr>
+            <w:tcW w:type="dxa" w:w="2560"/>
+            <w:tcBorders>
+              <w:top w:val="single" w:color="AAAAAA" w:sz="1"/>
+              <w:left w:val="single" w:color="AAAAAA" w:sz="1"/>
+              <w:bottom w:val="single" w:color="AAAAAA" w:sz="1"/>
+              <w:right w:val="single" w:color="AAAAAA" w:sz="1"/>
+            </w:tcBorders>
+            <w:shd w:fill="FFFFFF" w:val="clear"/>
+            <w:tcMar>
+              <w:top w:type="dxa" w:w="60"/>
+              <w:left w:type="dxa" w:w="100"/>
+              <w:bottom w:type="dxa" w:w="60"/>
+              <w:right w:type="dxa" w:w="100"/>
+            </w:tcMar>
+          </w:tcPr>
+          <w:p>
+            <w:r>
+              <w:rPr>
+                <w:rFonts w:ascii="Arial" w:cs="Arial" w:eastAsia="Arial" w:hAnsi="Arial"/>
+                <w:b w:val="false"/>
+                <w:bCs w:val="false"/>
+                <w:i w:val="false"/>
+                <w:iCs w:val="false"/>
+                <w:sz w:val="20"/>
+                <w:szCs w:val="20"/>
+              </w:rPr>
+              <w:t xml:space="preserve">Whether the Event is shown on the public list of available events. Set and cleared by the publish/unlist action; reversible; editable only while Scheduled; cleared automatically on transition to Cancelled or Postponed.</w:t>
+            </w:r>
+          </w:p>
+        </w:tc>
+      </w:tr>
+      <w:tr>
+        <w:tc>
+          <w:tcPr>
+            <w:tcW w:type="dxa" w:w="1900"/>
+            <w:tcBorders>
+              <w:top w:val="single" w:color="AAAAAA" w:sz="1"/>
+              <w:left w:val="single" w:color="AAAAAA" w:sz="1"/>
+              <w:bottom w:val="single" w:color="AAAAAA" w:sz="1"/>
+              <w:right w:val="single" w:color="AAAAAA" w:sz="1"/>
+            </w:tcBorders>
+            <w:shd w:fill="FFFFFF" w:val="clear"/>
+            <w:tcMar>
+              <w:top w:type="dxa" w:w="60"/>
+              <w:left w:type="dxa" w:w="100"/>
+              <w:bottom w:type="dxa" w:w="60"/>
+              <w:right w:type="dxa" w:w="100"/>
+            </w:tcMar>
+          </w:tcPr>
+          <w:p>
+            <w:r>
+              <w:rPr>
+                <w:rFonts w:ascii="Arial" w:cs="Arial" w:eastAsia="Arial" w:hAnsi="Arial"/>
+                <w:b w:val="false"/>
+                <w:bCs w:val="false"/>
+                <w:i w:val="false"/>
+                <w:iCs w:val="false"/>
+                <w:sz w:val="20"/>
+                <w:szCs w:val="20"/>
+              </w:rPr>
+              <w:t xml:space="preserve">publishedAt</w:t>
+            </w:r>
+          </w:p>
+        </w:tc>
+        <w:tc>
+          <w:tcPr>
+            <w:tcW w:type="dxa" w:w="1500"/>
+            <w:tcBorders>
+              <w:top w:val="single" w:color="AAAAAA" w:sz="1"/>
+              <w:left w:val="single" w:color="AAAAAA" w:sz="1"/>
+              <w:bottom w:val="single" w:color="AAAAAA" w:sz="1"/>
+              <w:right w:val="single" w:color="AAAAAA" w:sz="1"/>
+            </w:tcBorders>
+            <w:shd w:fill="FFFFFF" w:val="clear"/>
+            <w:tcMar>
+              <w:top w:type="dxa" w:w="60"/>
+              <w:left w:type="dxa" w:w="100"/>
+              <w:bottom w:type="dxa" w:w="60"/>
+              <w:right w:type="dxa" w:w="100"/>
+            </w:tcMar>
+          </w:tcPr>
+          <w:p>
+            <w:r>
+              <w:rPr>
+                <w:rFonts w:ascii="Arial" w:cs="Arial" w:eastAsia="Arial" w:hAnsi="Arial"/>
+                <w:b w:val="false"/>
+                <w:bCs w:val="false"/>
+                <w:i w:val="false"/>
+                <w:iCs w:val="false"/>
+                <w:sz w:val="20"/>
+                <w:szCs w:val="20"/>
+              </w:rPr>
+              <w:t xml:space="preserve">Event</w:t>
+            </w:r>
+          </w:p>
+        </w:tc>
+        <w:tc>
+          <w:tcPr>
+            <w:tcW w:type="dxa" w:w="950"/>
+            <w:tcBorders>
+              <w:top w:val="single" w:color="AAAAAA" w:sz="1"/>
+              <w:left w:val="single" w:color="AAAAAA" w:sz="1"/>
+              <w:bottom w:val="single" w:color="AAAAAA" w:sz="1"/>
+              <w:right w:val="single" w:color="AAAAAA" w:sz="1"/>
+            </w:tcBorders>
+            <w:shd w:fill="FFFFFF" w:val="clear"/>
+            <w:tcMar>
+              <w:top w:type="dxa" w:w="60"/>
+              <w:left w:type="dxa" w:w="100"/>
+              <w:bottom w:type="dxa" w:w="60"/>
+              <w:right w:type="dxa" w:w="100"/>
+            </w:tcMar>
+          </w:tcPr>
+          <w:p>
+            <w:r>
+              <w:rPr>
+                <w:rFonts w:ascii="Arial" w:cs="Arial" w:eastAsia="Arial" w:hAnsi="Arial"/>
+                <w:b w:val="false"/>
+                <w:bCs w:val="false"/>
+                <w:i w:val="false"/>
+                <w:iCs w:val="false"/>
+                <w:sz w:val="20"/>
+                <w:szCs w:val="20"/>
+              </w:rPr>
+              <w:t xml:space="preserve">datetime</w:t>
+            </w:r>
+          </w:p>
+        </w:tc>
+        <w:tc>
+          <w:tcPr>
+            <w:tcW w:type="dxa" w:w="2450"/>
+            <w:tcBorders>
+              <w:top w:val="single" w:color="AAAAAA" w:sz="1"/>
+              <w:left w:val="single" w:color="AAAAAA" w:sz="1"/>
+              <w:bottom w:val="single" w:color="AAAAAA" w:sz="1"/>
+              <w:right w:val="single" w:color="AAAAAA" w:sz="1"/>
+            </w:tcBorders>
+            <w:shd w:fill="FFFFFF" w:val="clear"/>
+            <w:tcMar>
+              <w:top w:type="dxa" w:w="60"/>
+              <w:left w:type="dxa" w:w="100"/>
+              <w:bottom w:type="dxa" w:w="60"/>
+              <w:right w:type="dxa" w:w="100"/>
+            </w:tcMar>
+          </w:tcPr>
+          <w:p>
+            <w:r>
+              <w:rPr>
+                <w:rFonts w:ascii="Arial" w:cs="Arial" w:eastAsia="Arial" w:hAnsi="Arial"/>
+                <w:b w:val="false"/>
+                <w:bCs w:val="false"/>
+                <w:i w:val="false"/>
+                <w:iCs w:val="false"/>
+                <w:sz w:val="20"/>
+                <w:szCs w:val="20"/>
+              </w:rPr>
+              <w:t xml:space="preserve">CR-EVENTS-MANAGE-DAT-055</w:t>
+            </w:r>
+          </w:p>
+        </w:tc>
+        <w:tc>
+          <w:tcPr>
+            <w:tcW w:type="dxa" w:w="2560"/>
+            <w:tcBorders>
+              <w:top w:val="single" w:color="AAAAAA" w:sz="1"/>
+              <w:left w:val="single" w:color="AAAAAA" w:sz="1"/>
+              <w:bottom w:val="single" w:color="AAAAAA" w:sz="1"/>
+              <w:right w:val="single" w:color="AAAAAA" w:sz="1"/>
+            </w:tcBorders>
+            <w:shd w:fill="FFFFFF" w:val="clear"/>
+            <w:tcMar>
+              <w:top w:type="dxa" w:w="60"/>
+              <w:left w:type="dxa" w:w="100"/>
+              <w:bottom w:type="dxa" w:w="60"/>
+              <w:right w:type="dxa" w:w="100"/>
+            </w:tcMar>
+          </w:tcPr>
+          <w:p>
+            <w:r>
+              <w:rPr>
+                <w:rFonts w:ascii="Arial" w:cs="Arial" w:eastAsia="Arial" w:hAnsi="Arial"/>
+                <w:b w:val="false"/>
+                <w:bCs w:val="false"/>
+                <w:i w:val="false"/>
+                <w:iCs w:val="false"/>
+                <w:sz w:val="20"/>
+                <w:szCs w:val="20"/>
+              </w:rPr>
+              <w:t xml:space="preserve">Time the Event was first listed publicly. System-set, read-only, retained if the Event is later unlisted.</w:t>
+            </w:r>
+          </w:p>
+        </w:tc>
+      </w:tr>
+    </w:tbl>
+    <w:p/>
     <w:p>
       <w:pPr>
         <w:pStyle w:val="Heading1"/>
@@ -20341,6 +21129,104 @@
               <w:bottom w:val="single" w:color="AAAAAA" w:sz="1"/>
               <w:right w:val="single" w:color="AAAAAA" w:sz="1"/>
             </w:tcBorders>
+            <w:shd w:fill="F2F7FB" w:val="clear"/>
+            <w:tcMar>
+              <w:top w:type="dxa" w:w="60"/>
+              <w:left w:type="dxa" w:w="100"/>
+              <w:bottom w:type="dxa" w:w="60"/>
+              <w:right w:type="dxa" w:w="100"/>
+            </w:tcMar>
+          </w:tcPr>
+          <w:p>
+            <w:r>
+              <w:rPr>
+                <w:rFonts w:ascii="Arial" w:cs="Arial" w:eastAsia="Arial" w:hAnsi="Arial"/>
+                <w:b/>
+                <w:bCs/>
+                <w:i w:val="false"/>
+                <w:iCs w:val="false"/>
+                <w:sz w:val="20"/>
+                <w:szCs w:val="20"/>
+              </w:rPr>
+              <w:t xml:space="preserve">1.2</w:t>
+            </w:r>
+          </w:p>
+        </w:tc>
+        <w:tc>
+          <w:tcPr>
+            <w:tcW w:type="dxa" w:w="1900"/>
+            <w:tcBorders>
+              <w:top w:val="single" w:color="AAAAAA" w:sz="1"/>
+              <w:left w:val="single" w:color="AAAAAA" w:sz="1"/>
+              <w:bottom w:val="single" w:color="AAAAAA" w:sz="1"/>
+              <w:right w:val="single" w:color="AAAAAA" w:sz="1"/>
+            </w:tcBorders>
+            <w:shd w:fill="F2F7FB" w:val="clear"/>
+            <w:tcMar>
+              <w:top w:type="dxa" w:w="60"/>
+              <w:left w:type="dxa" w:w="100"/>
+              <w:bottom w:type="dxa" w:w="60"/>
+              <w:right w:type="dxa" w:w="100"/>
+            </w:tcMar>
+          </w:tcPr>
+          <w:p>
+            <w:r>
+              <w:rPr>
+                <w:rFonts w:ascii="Arial" w:cs="Arial" w:eastAsia="Arial" w:hAnsi="Arial"/>
+                <w:b w:val="false"/>
+                <w:bCs w:val="false"/>
+                <w:i w:val="false"/>
+                <w:iCs w:val="false"/>
+                <w:sz w:val="20"/>
+                <w:szCs w:val="20"/>
+              </w:rPr>
+              <w:t xml:space="preserve">05-29-26 16:30</w:t>
+            </w:r>
+          </w:p>
+        </w:tc>
+        <w:tc>
+          <w:tcPr>
+            <w:tcW w:type="dxa" w:w="6160"/>
+            <w:tcBorders>
+              <w:top w:val="single" w:color="AAAAAA" w:sz="1"/>
+              <w:left w:val="single" w:color="AAAAAA" w:sz="1"/>
+              <w:bottom w:val="single" w:color="AAAAAA" w:sz="1"/>
+              <w:right w:val="single" w:color="AAAAAA" w:sz="1"/>
+            </w:tcBorders>
+            <w:shd w:fill="F2F7FB" w:val="clear"/>
+            <w:tcMar>
+              <w:top w:type="dxa" w:w="60"/>
+              <w:left w:type="dxa" w:w="100"/>
+              <w:bottom w:type="dxa" w:w="60"/>
+              <w:right w:type="dxa" w:w="100"/>
+            </w:tcMar>
+          </w:tcPr>
+          <w:p>
+            <w:r>
+              <w:rPr>
+                <w:rFonts w:ascii="Arial" w:cs="Arial" w:eastAsia="Arial" w:hAnsi="Arial"/>
+                <w:b w:val="false"/>
+                <w:bCs w:val="false"/>
+                <w:i w:val="false"/>
+                <w:iCs w:val="false"/>
+                <w:sz w:val="20"/>
+                <w:szCs w:val="20"/>
+              </w:rPr>
+              <w:t xml:space="preserve">Added the event-publishing and public-discovery workflow (publish-to-list via listedPublicly; public browse-and-register through the custom web application), the optional recording-migration step (recordingUrl → edited Resource), data items DAT-054 (listedPublicly) and DAT-055 (publishedAt), and requirements REQ-055 through REQ-057. Noted automatic unlisting on Cancel and Postpone.</w:t>
+            </w:r>
+          </w:p>
+        </w:tc>
+      </w:tr>
+      <w:tr>
+        <w:tc>
+          <w:tcPr>
+            <w:tcW w:type="dxa" w:w="1300"/>
+            <w:tcBorders>
+              <w:top w:val="single" w:color="AAAAAA" w:sz="1"/>
+              <w:left w:val="single" w:color="AAAAAA" w:sz="1"/>
+              <w:bottom w:val="single" w:color="AAAAAA" w:sz="1"/>
+              <w:right w:val="single" w:color="AAAAAA" w:sz="1"/>
+            </w:tcBorders>
             <w:tcMar>
               <w:top w:type="dxa" w:w="60"/>
               <w:left w:type="dxa" w:w="100"/>

</xml_diff>